<commit_message>
fix(forms): rebuild Group B templates from official GPPB files (I1-templates)
Replace the stub docx templates with the full official GPPB bodies, insert a
{{ disclaimer }} paragraph at the top, and convert only the header tokens to
Jinja. Bidder/price/affiant/notary text stays as official blank text. Add a
{{ disclaimer }} paragraph to market.docx. Tests guard against stub regressions.

Co-Authored-By: Claude Opus 4.8 (1M context) <noreply@anthropic.com>
</commit_message>
<xml_diff>
--- a/backend/templates/forms/market.docx
+++ b/backend/templates/forms/market.docx
@@ -3629,6 +3629,11 @@
           <w:iCs/>
         </w:rPr>
       </w:pPr>
+    </w:p>
+    <w:p>
+      <w:r>
+        <w:t>{{ disclaimer }}</w:t>
+      </w:r>
     </w:p>
     <w:sectPr>
       <w:footerReference w:type="default" r:id="rId11"/>

</xml_diff>